<commit_message>
Add cover design, thumbnail and sales page copy
Cover (1600x2560) and Brain/note thumbnail (1280x670) rendered from
cover/cover.html; cover image placed on the first page of the .docx.
sales-page.md holds the sales page text, FAQ and SNS posts.

Co-Authored-By: Claude Opus 5.5 <noreply@anthropic.com>
Claude-Session: https://claude.ai/code/session_01RD6QW6TNVpFD5aqQMgggZ3
</commit_message>
<xml_diff>
--- a/mindset-book/人生を変える64の習慣リスト.docx
+++ b/mindset-book/人生を変える64の習慣リスト.docx
@@ -4,53 +4,47 @@
   <w:body>
     <w:p>
       <w:pPr>
-        <w:spacing w:before="3600"/>
-      </w:pPr>
-    </w:p>
-    <w:p>
-      <w:pPr>
-        <w:spacing w:after="360"/>
         <w:jc w:val="center"/>
       </w:pPr>
       <w:r>
-        <w:rPr>
-          <w:rFonts w:ascii="Meiryo" w:eastAsia="Meiryo" w:hAnsi="Meiryo"/>
-          <w:b/>
-          <w:bCs/>
-          <w:sz w:val="52"/>
-          <w:szCs w:val="52"/>
-        </w:rPr>
-        <w:t xml:space="preserve">人生を変える64の習慣リスト</w:t>
-      </w:r>
-    </w:p>
-    <w:p>
-      <w:pPr>
-        <w:spacing w:after="2400"/>
-        <w:jc w:val="center"/>
-      </w:pPr>
-      <w:r>
-        <w:rPr>
-          <w:rFonts w:ascii="Meiryo" w:eastAsia="Meiryo" w:hAnsi="Meiryo"/>
-          <w:color w:val="7F7F7F"/>
-          <w:sz w:val="28"/>
-          <w:szCs w:val="28"/>
-        </w:rPr>
-        <w:t xml:space="preserve">〜副業で「最初の1円」をつかむためのマインドセット〜</w:t>
-      </w:r>
-    </w:p>
-    <w:p>
-      <w:pPr>
-        <w:jc w:val="center"/>
-      </w:pPr>
-      <w:r>
-        <w:rPr>
-          <w:rFonts w:ascii="Meiryo" w:eastAsia="Meiryo" w:hAnsi="Meiryo"/>
-          <w:b/>
-          <w:bCs/>
-          <w:sz w:val="32"/>
-          <w:szCs w:val="32"/>
-        </w:rPr>
-        <w:t xml:space="preserve">りゅう坊</w:t>
+        <w:drawing>
+          <wp:inline distT="0" distB="0" distL="0" distR="0">
+            <wp:extent cx="5505450" cy="8810625"/>
+            <wp:effectExtent t="0" r="0" b="0" l="0"/>
+            <wp:docPr id="1" name="cover" descr="人生を変える64の習慣リスト　副業で「最初の1円」をつかむためのマインドセット　りゅう坊" title="人生を変える64の習慣リスト"/>
+            <wp:cNvGraphicFramePr>
+              <a:graphicFrameLocks xmlns:a="http://schemas.openxmlformats.org/drawingml/2006/main" noChangeAspect="1"/>
+            </wp:cNvGraphicFramePr>
+            <a:graphic xmlns:a="http://schemas.openxmlformats.org/drawingml/2006/main">
+              <a:graphicData uri="http://schemas.openxmlformats.org/drawingml/2006/picture">
+                <pic:pic xmlns:pic="http://schemas.openxmlformats.org/drawingml/2006/picture">
+                  <pic:nvPicPr>
+                    <pic:cNvPr id="0" name="" descr=""/>
+                    <pic:cNvPicPr>
+                      <a:picLocks noChangeAspect="1" noChangeArrowheads="1"/>
+                    </pic:cNvPicPr>
+                  </pic:nvPicPr>
+                  <pic:blipFill>
+                    <a:blip r:embed="rId9" cstate="none"/>
+                    <a:srcRect/>
+                    <a:stretch>
+                      <a:fillRect/>
+                    </a:stretch>
+                  </pic:blipFill>
+                  <pic:spPr bwMode="auto">
+                    <a:xfrm>
+                      <a:off x="0" y="0"/>
+                      <a:ext cx="5505450" cy="8810625"/>
+                    </a:xfrm>
+                    <a:prstGeom prst="rect">
+                      <a:avLst/>
+                    </a:prstGeom>
+                  </pic:spPr>
+                </pic:pic>
+              </a:graphicData>
+            </a:graphic>
+          </wp:inline>
+        </w:drawing>
       </w:r>
     </w:p>
     <w:p>

</xml_diff>

<commit_message>
Add Brain-ready PDF and paste-ready sales text
Build a PDF with an embedded font (BOOK_FONT env var in build.js),
keep chapter summaries on one page, and add brain-paste.txt for the
Brain editor with clearer placeholder markers.

Co-Authored-By: Claude Opus 5.5 <noreply@anthropic.com>
Claude-Session: https://claude.ai/code/session_01RD6QW6TNVpFD5aqQMgggZ3
</commit_message>
<xml_diff>
--- a/mindset-book/人生を変える64の習慣リスト.docx
+++ b/mindset-book/人生を変える64の習慣リスト.docx
@@ -1765,6 +1765,7 @@
     </w:p>
     <w:p>
       <w:pPr>
+        <w:keepNext/>
         <w:spacing w:after="60"/>
         <w:ind w:left="360"/>
       </w:pPr>
@@ -1786,6 +1787,7 @@
     </w:p>
     <w:p>
       <w:pPr>
+        <w:keepNext/>
         <w:spacing w:after="60"/>
         <w:ind w:left="360"/>
       </w:pPr>
@@ -1807,6 +1809,7 @@
     </w:p>
     <w:p>
       <w:pPr>
+        <w:keepNext/>
         <w:spacing w:after="60"/>
         <w:ind w:left="360"/>
       </w:pPr>
@@ -1828,6 +1831,7 @@
     </w:p>
     <w:p>
       <w:pPr>
+        <w:keepNext/>
         <w:spacing w:after="60"/>
         <w:ind w:left="360"/>
       </w:pPr>
@@ -1849,6 +1853,7 @@
     </w:p>
     <w:p>
       <w:pPr>
+        <w:keepNext/>
         <w:spacing w:after="60"/>
         <w:ind w:left="360"/>
       </w:pPr>
@@ -1870,6 +1875,7 @@
     </w:p>
     <w:p>
       <w:pPr>
+        <w:keepNext/>
         <w:spacing w:after="60"/>
         <w:ind w:left="360"/>
       </w:pPr>
@@ -1891,6 +1897,7 @@
     </w:p>
     <w:p>
       <w:pPr>
+        <w:keepNext/>
         <w:spacing w:after="60"/>
         <w:ind w:left="360"/>
       </w:pPr>
@@ -1912,6 +1919,7 @@
     </w:p>
     <w:p>
       <w:pPr>
+        <w:keepNext w:val="false"/>
         <w:spacing w:after="60"/>
         <w:ind w:left="360"/>
       </w:pPr>
@@ -3122,6 +3130,7 @@
     </w:p>
     <w:p>
       <w:pPr>
+        <w:keepNext/>
         <w:spacing w:after="60"/>
         <w:ind w:left="360"/>
       </w:pPr>
@@ -3143,6 +3152,7 @@
     </w:p>
     <w:p>
       <w:pPr>
+        <w:keepNext/>
         <w:spacing w:after="60"/>
         <w:ind w:left="360"/>
       </w:pPr>
@@ -3164,6 +3174,7 @@
     </w:p>
     <w:p>
       <w:pPr>
+        <w:keepNext/>
         <w:spacing w:after="60"/>
         <w:ind w:left="360"/>
       </w:pPr>
@@ -3185,6 +3196,7 @@
     </w:p>
     <w:p>
       <w:pPr>
+        <w:keepNext/>
         <w:spacing w:after="60"/>
         <w:ind w:left="360"/>
       </w:pPr>
@@ -3206,6 +3218,7 @@
     </w:p>
     <w:p>
       <w:pPr>
+        <w:keepNext/>
         <w:spacing w:after="60"/>
         <w:ind w:left="360"/>
       </w:pPr>
@@ -3227,6 +3240,7 @@
     </w:p>
     <w:p>
       <w:pPr>
+        <w:keepNext/>
         <w:spacing w:after="60"/>
         <w:ind w:left="360"/>
       </w:pPr>
@@ -3248,6 +3262,7 @@
     </w:p>
     <w:p>
       <w:pPr>
+        <w:keepNext/>
         <w:spacing w:after="60"/>
         <w:ind w:left="360"/>
       </w:pPr>
@@ -3269,6 +3284,7 @@
     </w:p>
     <w:p>
       <w:pPr>
+        <w:keepNext w:val="false"/>
         <w:spacing w:after="60"/>
         <w:ind w:left="360"/>
       </w:pPr>
@@ -4533,6 +4549,7 @@
     </w:p>
     <w:p>
       <w:pPr>
+        <w:keepNext/>
         <w:spacing w:after="60"/>
         <w:ind w:left="360"/>
       </w:pPr>
@@ -4554,6 +4571,7 @@
     </w:p>
     <w:p>
       <w:pPr>
+        <w:keepNext/>
         <w:spacing w:after="60"/>
         <w:ind w:left="360"/>
       </w:pPr>
@@ -4575,6 +4593,7 @@
     </w:p>
     <w:p>
       <w:pPr>
+        <w:keepNext/>
         <w:spacing w:after="60"/>
         <w:ind w:left="360"/>
       </w:pPr>
@@ -4596,6 +4615,7 @@
     </w:p>
     <w:p>
       <w:pPr>
+        <w:keepNext/>
         <w:spacing w:after="60"/>
         <w:ind w:left="360"/>
       </w:pPr>
@@ -4617,6 +4637,7 @@
     </w:p>
     <w:p>
       <w:pPr>
+        <w:keepNext/>
         <w:spacing w:after="60"/>
         <w:ind w:left="360"/>
       </w:pPr>
@@ -4638,6 +4659,7 @@
     </w:p>
     <w:p>
       <w:pPr>
+        <w:keepNext/>
         <w:spacing w:after="60"/>
         <w:ind w:left="360"/>
       </w:pPr>
@@ -4659,6 +4681,7 @@
     </w:p>
     <w:p>
       <w:pPr>
+        <w:keepNext/>
         <w:spacing w:after="60"/>
         <w:ind w:left="360"/>
       </w:pPr>
@@ -4680,6 +4703,7 @@
     </w:p>
     <w:p>
       <w:pPr>
+        <w:keepNext w:val="false"/>
         <w:spacing w:after="60"/>
         <w:ind w:left="360"/>
       </w:pPr>
@@ -5960,6 +5984,7 @@
     </w:p>
     <w:p>
       <w:pPr>
+        <w:keepNext/>
         <w:spacing w:after="60"/>
         <w:ind w:left="360"/>
       </w:pPr>
@@ -5981,6 +6006,7 @@
     </w:p>
     <w:p>
       <w:pPr>
+        <w:keepNext/>
         <w:spacing w:after="60"/>
         <w:ind w:left="360"/>
       </w:pPr>
@@ -6002,6 +6028,7 @@
     </w:p>
     <w:p>
       <w:pPr>
+        <w:keepNext/>
         <w:spacing w:after="60"/>
         <w:ind w:left="360"/>
       </w:pPr>
@@ -6023,6 +6050,7 @@
     </w:p>
     <w:p>
       <w:pPr>
+        <w:keepNext/>
         <w:spacing w:after="60"/>
         <w:ind w:left="360"/>
       </w:pPr>
@@ -6044,6 +6072,7 @@
     </w:p>
     <w:p>
       <w:pPr>
+        <w:keepNext/>
         <w:spacing w:after="60"/>
         <w:ind w:left="360"/>
       </w:pPr>
@@ -6065,6 +6094,7 @@
     </w:p>
     <w:p>
       <w:pPr>
+        <w:keepNext/>
         <w:spacing w:after="60"/>
         <w:ind w:left="360"/>
       </w:pPr>
@@ -6086,6 +6116,7 @@
     </w:p>
     <w:p>
       <w:pPr>
+        <w:keepNext/>
         <w:spacing w:after="60"/>
         <w:ind w:left="360"/>
       </w:pPr>
@@ -6107,6 +6138,7 @@
     </w:p>
     <w:p>
       <w:pPr>
+        <w:keepNext w:val="false"/>
         <w:spacing w:after="60"/>
         <w:ind w:left="360"/>
       </w:pPr>
@@ -7313,6 +7345,7 @@
     </w:p>
     <w:p>
       <w:pPr>
+        <w:keepNext/>
         <w:spacing w:after="60"/>
         <w:ind w:left="360"/>
       </w:pPr>
@@ -7334,6 +7367,7 @@
     </w:p>
     <w:p>
       <w:pPr>
+        <w:keepNext/>
         <w:spacing w:after="60"/>
         <w:ind w:left="360"/>
       </w:pPr>
@@ -7355,6 +7389,7 @@
     </w:p>
     <w:p>
       <w:pPr>
+        <w:keepNext/>
         <w:spacing w:after="60"/>
         <w:ind w:left="360"/>
       </w:pPr>
@@ -7376,6 +7411,7 @@
     </w:p>
     <w:p>
       <w:pPr>
+        <w:keepNext/>
         <w:spacing w:after="60"/>
         <w:ind w:left="360"/>
       </w:pPr>
@@ -7397,6 +7433,7 @@
     </w:p>
     <w:p>
       <w:pPr>
+        <w:keepNext/>
         <w:spacing w:after="60"/>
         <w:ind w:left="360"/>
       </w:pPr>
@@ -7418,6 +7455,7 @@
     </w:p>
     <w:p>
       <w:pPr>
+        <w:keepNext/>
         <w:spacing w:after="60"/>
         <w:ind w:left="360"/>
       </w:pPr>
@@ -7439,6 +7477,7 @@
     </w:p>
     <w:p>
       <w:pPr>
+        <w:keepNext/>
         <w:spacing w:after="60"/>
         <w:ind w:left="360"/>
       </w:pPr>
@@ -7460,6 +7499,7 @@
     </w:p>
     <w:p>
       <w:pPr>
+        <w:keepNext w:val="false"/>
         <w:spacing w:after="60"/>
         <w:ind w:left="360"/>
       </w:pPr>
@@ -8698,6 +8738,7 @@
     </w:p>
     <w:p>
       <w:pPr>
+        <w:keepNext/>
         <w:spacing w:after="60"/>
         <w:ind w:left="360"/>
       </w:pPr>
@@ -8719,6 +8760,7 @@
     </w:p>
     <w:p>
       <w:pPr>
+        <w:keepNext/>
         <w:spacing w:after="60"/>
         <w:ind w:left="360"/>
       </w:pPr>
@@ -8740,6 +8782,7 @@
     </w:p>
     <w:p>
       <w:pPr>
+        <w:keepNext/>
         <w:spacing w:after="60"/>
         <w:ind w:left="360"/>
       </w:pPr>
@@ -8761,6 +8804,7 @@
     </w:p>
     <w:p>
       <w:pPr>
+        <w:keepNext/>
         <w:spacing w:after="60"/>
         <w:ind w:left="360"/>
       </w:pPr>
@@ -8782,6 +8826,7 @@
     </w:p>
     <w:p>
       <w:pPr>
+        <w:keepNext/>
         <w:spacing w:after="60"/>
         <w:ind w:left="360"/>
       </w:pPr>
@@ -8803,6 +8848,7 @@
     </w:p>
     <w:p>
       <w:pPr>
+        <w:keepNext/>
         <w:spacing w:after="60"/>
         <w:ind w:left="360"/>
       </w:pPr>
@@ -8824,6 +8870,7 @@
     </w:p>
     <w:p>
       <w:pPr>
+        <w:keepNext/>
         <w:spacing w:after="60"/>
         <w:ind w:left="360"/>
       </w:pPr>
@@ -8845,6 +8892,7 @@
     </w:p>
     <w:p>
       <w:pPr>
+        <w:keepNext w:val="false"/>
         <w:spacing w:after="60"/>
         <w:ind w:left="360"/>
       </w:pPr>
@@ -10045,6 +10093,7 @@
     </w:p>
     <w:p>
       <w:pPr>
+        <w:keepNext/>
         <w:spacing w:after="60"/>
         <w:ind w:left="360"/>
       </w:pPr>
@@ -10066,6 +10115,7 @@
     </w:p>
     <w:p>
       <w:pPr>
+        <w:keepNext/>
         <w:spacing w:after="60"/>
         <w:ind w:left="360"/>
       </w:pPr>
@@ -10087,6 +10137,7 @@
     </w:p>
     <w:p>
       <w:pPr>
+        <w:keepNext/>
         <w:spacing w:after="60"/>
         <w:ind w:left="360"/>
       </w:pPr>
@@ -10108,6 +10159,7 @@
     </w:p>
     <w:p>
       <w:pPr>
+        <w:keepNext/>
         <w:spacing w:after="60"/>
         <w:ind w:left="360"/>
       </w:pPr>
@@ -10129,6 +10181,7 @@
     </w:p>
     <w:p>
       <w:pPr>
+        <w:keepNext/>
         <w:spacing w:after="60"/>
         <w:ind w:left="360"/>
       </w:pPr>
@@ -10150,6 +10203,7 @@
     </w:p>
     <w:p>
       <w:pPr>
+        <w:keepNext/>
         <w:spacing w:after="60"/>
         <w:ind w:left="360"/>
       </w:pPr>
@@ -10171,6 +10225,7 @@
     </w:p>
     <w:p>
       <w:pPr>
+        <w:keepNext/>
         <w:spacing w:after="60"/>
         <w:ind w:left="360"/>
       </w:pPr>
@@ -10192,6 +10247,7 @@
     </w:p>
     <w:p>
       <w:pPr>
+        <w:keepNext w:val="false"/>
         <w:spacing w:after="60"/>
         <w:ind w:left="360"/>
       </w:pPr>
@@ -11413,6 +11469,7 @@
     </w:p>
     <w:p>
       <w:pPr>
+        <w:keepNext/>
         <w:spacing w:after="60"/>
         <w:ind w:left="360"/>
       </w:pPr>
@@ -11434,6 +11491,7 @@
     </w:p>
     <w:p>
       <w:pPr>
+        <w:keepNext/>
         <w:spacing w:after="60"/>
         <w:ind w:left="360"/>
       </w:pPr>
@@ -11455,6 +11513,7 @@
     </w:p>
     <w:p>
       <w:pPr>
+        <w:keepNext/>
         <w:spacing w:after="60"/>
         <w:ind w:left="360"/>
       </w:pPr>
@@ -11476,6 +11535,7 @@
     </w:p>
     <w:p>
       <w:pPr>
+        <w:keepNext/>
         <w:spacing w:after="60"/>
         <w:ind w:left="360"/>
       </w:pPr>
@@ -11497,6 +11557,7 @@
     </w:p>
     <w:p>
       <w:pPr>
+        <w:keepNext/>
         <w:spacing w:after="60"/>
         <w:ind w:left="360"/>
       </w:pPr>
@@ -11518,6 +11579,7 @@
     </w:p>
     <w:p>
       <w:pPr>
+        <w:keepNext/>
         <w:spacing w:after="60"/>
         <w:ind w:left="360"/>
       </w:pPr>
@@ -11539,6 +11601,7 @@
     </w:p>
     <w:p>
       <w:pPr>
+        <w:keepNext/>
         <w:spacing w:after="60"/>
         <w:ind w:left="360"/>
       </w:pPr>
@@ -11560,6 +11623,7 @@
     </w:p>
     <w:p>
       <w:pPr>
+        <w:keepNext w:val="false"/>
         <w:spacing w:after="60"/>
         <w:ind w:left="360"/>
       </w:pPr>

</xml_diff>